<commit_message>
docs: Corrección final de apartados 1-5 (BBDD con 5 tablas)
</commit_message>
<xml_diff>
--- a/docs/memoria escrita.docx
+++ b/docs/memoria escrita.docx
@@ -4435,7 +4435,16 @@
         <w:t xml:space="preserve"> (Persistencia Relacional): </w:t>
       </w:r>
       <w:r>
-        <w:t>Diseñar e implementar una base de datos relacional en MySQL, con las entidades Usuarios, Eventos y Reservas</w:t>
+        <w:t>Diseñar e implementar una base de datos relacional en MySQL, con las entidades Usuarios, Eventos</w:t>
+      </w:r>
+      <w:r>
+        <w:t>,</w:t>
+      </w:r>
+      <w:r>
+        <w:t xml:space="preserve"> Reservas</w:t>
+      </w:r>
+      <w:r>
+        <w:t>, Comentarios y Valoraciones</w:t>
       </w:r>
       <w:r>
         <w:t xml:space="preserve"> como </w:t>
@@ -4444,13 +4453,7 @@
         <w:t xml:space="preserve">estructura </w:t>
       </w:r>
       <w:r>
-        <w:t xml:space="preserve">relacional </w:t>
-      </w:r>
-      <w:r>
-        <w:t>mínim</w:t>
-      </w:r>
-      <w:r>
-        <w:t>a</w:t>
+        <w:t>relacional</w:t>
       </w:r>
       <w:r>
         <w:t>, para el almacenamiento seguro, persistente y con integridad referencial</w:t>
@@ -8291,21 +8294,13 @@
         <w:t xml:space="preserve"> del proyecto un archivo </w:t>
       </w:r>
       <w:r>
-        <w:t xml:space="preserve">de filtrado </w:t>
-      </w:r>
-      <w:proofErr w:type="gramStart"/>
-      <w:r>
-        <w:t>(</w:t>
+        <w:t>de filtrado (</w:t>
       </w:r>
       <w:r>
         <w:t>.</w:t>
       </w:r>
       <w:r>
-        <w:t>gitignore</w:t>
-      </w:r>
-      <w:proofErr w:type="gramEnd"/>
-      <w:r>
-        <w:t xml:space="preserve">) </w:t>
+        <w:t xml:space="preserve">gitignore) </w:t>
       </w:r>
       <w:r>
         <w:t xml:space="preserve">en la raíz del proyecto </w:t>
@@ -8717,7 +8712,10 @@
             </w:r>
             <w:proofErr w:type="spellStart"/>
             <w:r>
-              <w:t>foundation</w:t>
+              <w:t>F</w:t>
+            </w:r>
+            <w:r>
+              <w:t>oundation</w:t>
             </w:r>
             <w:proofErr w:type="spellEnd"/>
             <w:r>
@@ -10123,6 +10121,23 @@
       </w:r>
       <w:r>
         <w:t xml:space="preserve"> proporcionado</w:t>
+      </w:r>
+      <w:r>
+        <w:t xml:space="preserve"> </w:t>
+      </w:r>
+      <w:r>
+        <w:t>(Ga</w:t>
+      </w:r>
+      <w:r>
+        <w:t xml:space="preserve">nttProject </w:t>
+      </w:r>
+      <w:proofErr w:type="spellStart"/>
+      <w:r>
+        <w:t>Team</w:t>
+      </w:r>
+      <w:proofErr w:type="spellEnd"/>
+      <w:r>
+        <w:t>. (2026)</w:t>
       </w:r>
       <w:r>
         <w:t>.</w:t>
@@ -10238,30 +10253,14 @@
           <w:i/>
           <w:iCs/>
         </w:rPr>
-        <w:t xml:space="preserve">Figura </w:t>
-      </w:r>
-      <w:proofErr w:type="gramStart"/>
+        <w:t>Figura 2.</w:t>
+      </w:r>
       <w:r>
         <w:rPr>
           <w:i/>
           <w:iCs/>
         </w:rPr>
-        <w:t>2.</w:t>
-      </w:r>
-      <w:r>
-        <w:rPr>
-          <w:i/>
-          <w:iCs/>
-        </w:rPr>
-        <w:t>Diagrama</w:t>
-      </w:r>
-      <w:proofErr w:type="gramEnd"/>
-      <w:r>
-        <w:rPr>
-          <w:i/>
-          <w:iCs/>
-        </w:rPr>
-        <w:t xml:space="preserve"> de Gantt inicial del proyecto. Fuente: elaboración propia.</w:t>
+        <w:t>Diagrama de Gantt inicial del proyecto. Fuente: elaboración propia.</w:t>
       </w:r>
     </w:p>
     <w:p>
@@ -11967,6 +11966,49 @@
           <w:iCs/>
         </w:rPr>
         <w:t>https://spring.io/projects/spring-boot</w:t>
+      </w:r>
+    </w:p>
+    <w:p>
+      <w:pPr>
+        <w:pStyle w:val="Prrafodelista"/>
+        <w:numPr>
+          <w:ilvl w:val="0"/>
+          <w:numId w:val="16"/>
+        </w:numPr>
+        <w:rPr>
+          <w:i/>
+          <w:iCs/>
+        </w:rPr>
+      </w:pPr>
+      <w:r>
+        <w:rPr>
+          <w:i/>
+          <w:iCs/>
+        </w:rPr>
+        <w:t xml:space="preserve">GanttProject </w:t>
+      </w:r>
+      <w:proofErr w:type="spellStart"/>
+      <w:r>
+        <w:rPr>
+          <w:i/>
+          <w:iCs/>
+        </w:rPr>
+        <w:t>Team</w:t>
+      </w:r>
+      <w:proofErr w:type="spellEnd"/>
+      <w:r>
+        <w:rPr>
+          <w:i/>
+          <w:iCs/>
+        </w:rPr>
+        <w:t xml:space="preserve">. (2026). GanttProject: Free Project Management App. Recuperado de </w:t>
+      </w:r>
+      <w:r>
+        <w:rPr>
+          <w:i/>
+          <w:iCs/>
+        </w:rPr>
+        <w:t>https://www.ganttproject.biz/</w:t>
       </w:r>
     </w:p>
     <w:p>
@@ -16646,7 +16688,6 @@
   <w:style w:type="character" w:default="1" w:styleId="Fuentedeprrafopredeter">
     <w:name w:val="Default Paragraph Font"/>
     <w:uiPriority w:val="1"/>
-    <w:semiHidden/>
     <w:unhideWhenUsed/>
   </w:style>
   <w:style w:type="table" w:default="1" w:styleId="Tablanormal">

</xml_diff>